<commit_message>
docs: update rl to llm study materials
</commit_message>
<xml_diff>
--- a/Reinforcement learning/RL回顾.docx
+++ b/Reinforcement learning/RL回顾.docx
@@ -31,9 +31,6 @@
     <w:p>
       <w:pPr>
         <w:pStyle w:val="af3"/>
-        <w:rPr>
-          <w:rFonts w:hint="eastAsia"/>
-        </w:rPr>
       </w:pPr>
       <w:r>
         <w:t>F</w:t>
@@ -252,9 +249,6 @@
       <w:pPr>
         <w:pStyle w:val="af5"/>
         <w:ind w:firstLine="480"/>
-        <w:rPr>
-          <w:rFonts w:hint="eastAsia"/>
-        </w:rPr>
       </w:pPr>
     </w:p>
     <w:p>
@@ -286,9 +280,6 @@
       <w:pPr>
         <w:pStyle w:val="af5"/>
         <w:ind w:firstLineChars="0" w:firstLine="0"/>
-        <w:rPr>
-          <w:rFonts w:hint="eastAsia"/>
-        </w:rPr>
       </w:pPr>
     </w:p>
     <w:p>
@@ -353,9 +344,6 @@
       <w:pPr>
         <w:pStyle w:val="af5"/>
         <w:ind w:firstLineChars="0" w:firstLine="0"/>
-        <w:rPr>
-          <w:rFonts w:hint="eastAsia"/>
-        </w:rPr>
       </w:pPr>
       <w:r>
         <w:rPr>
@@ -455,6 +443,7 @@
         <w:rPr>
           <w:noProof/>
         </w:rPr>
+        <w:lastRenderedPageBreak/>
         <w:drawing>
           <wp:inline distT="0" distB="0" distL="0" distR="0" wp14:anchorId="0876B1C9" wp14:editId="368006B6">
             <wp:extent cx="5731510" cy="2056765"/>
@@ -496,9 +485,6 @@
       <w:pPr>
         <w:pStyle w:val="af5"/>
         <w:ind w:firstLineChars="0" w:firstLine="0"/>
-        <w:rPr>
-          <w:rFonts w:hint="eastAsia"/>
-        </w:rPr>
       </w:pPr>
       <w:r>
         <w:rPr>
@@ -609,9 +595,6 @@
       <w:pPr>
         <w:pStyle w:val="af5"/>
         <w:ind w:firstLine="480"/>
-        <w:rPr>
-          <w:rFonts w:hint="eastAsia"/>
-        </w:rPr>
       </w:pPr>
       <w:r>
         <w:rPr>
@@ -699,7 +682,14 @@
         <w:rPr>
           <w:rFonts w:hint="eastAsia"/>
         </w:rPr>
-        <w:t>去选</w:t>
+        <w:t>去</w:t>
+      </w:r>
+      <w:r>
+        <w:rPr>
+          <w:rFonts w:hint="eastAsia"/>
+        </w:rPr>
+        <w:lastRenderedPageBreak/>
+        <w:t>选</w:t>
       </w:r>
       <w:r>
         <w:rPr>
@@ -718,9 +708,6 @@
       <w:pPr>
         <w:pStyle w:val="af5"/>
         <w:ind w:firstLineChars="0" w:firstLine="0"/>
-        <w:rPr>
-          <w:rFonts w:hint="eastAsia"/>
-        </w:rPr>
       </w:pPr>
       <w:r>
         <w:rPr>
@@ -961,16 +948,19 @@
       <w:pPr>
         <w:pStyle w:val="af5"/>
         <w:ind w:firstLineChars="0" w:firstLine="420"/>
-      </w:pPr>
-      <w:r>
         <w:rPr>
           <w:noProof/>
         </w:rPr>
+      </w:pPr>
+      <w:r>
+        <w:rPr>
+          <w:noProof/>
+        </w:rPr>
         <w:drawing>
-          <wp:inline distT="0" distB="0" distL="0" distR="0" wp14:anchorId="450CC260" wp14:editId="5810E153">
-            <wp:extent cx="5731510" cy="4300855"/>
-            <wp:effectExtent l="0" t="0" r="2540" b="4445"/>
-            <wp:docPr id="962006712" name="图片 1"/>
+          <wp:inline distT="0" distB="0" distL="0" distR="0" wp14:anchorId="310C587C" wp14:editId="77338465">
+            <wp:extent cx="5731510" cy="4248785"/>
+            <wp:effectExtent l="0" t="0" r="2540" b="0"/>
+            <wp:docPr id="50610363" name="图片 1"/>
             <wp:cNvGraphicFramePr>
               <a:graphicFrameLocks xmlns:a="http://schemas.openxmlformats.org/drawingml/2006/main" noChangeAspect="1"/>
             </wp:cNvGraphicFramePr>
@@ -978,7 +968,7 @@
               <a:graphicData uri="http://schemas.openxmlformats.org/drawingml/2006/picture">
                 <pic:pic xmlns:pic="http://schemas.openxmlformats.org/drawingml/2006/picture">
                   <pic:nvPicPr>
-                    <pic:cNvPr id="962006712" name=""/>
+                    <pic:cNvPr id="50610363" name=""/>
                     <pic:cNvPicPr/>
                   </pic:nvPicPr>
                   <pic:blipFill>
@@ -990,7 +980,7 @@
                   <pic:spPr>
                     <a:xfrm>
                       <a:off x="0" y="0"/>
-                      <a:ext cx="5731510" cy="4300855"/>
+                      <a:ext cx="5731510" cy="4248785"/>
                     </a:xfrm>
                     <a:prstGeom prst="rect">
                       <a:avLst/>
@@ -1006,36 +996,28 @@
     <w:p>
       <w:pPr>
         <w:pStyle w:val="af5"/>
-        <w:ind w:firstLineChars="0" w:firstLine="420"/>
-      </w:pPr>
-    </w:p>
-    <w:p>
-      <w:pPr>
-        <w:pStyle w:val="af5"/>
-        <w:ind w:firstLineChars="0" w:firstLine="420"/>
-      </w:pPr>
-    </w:p>
-    <w:p>
-      <w:pPr>
-        <w:pStyle w:val="af5"/>
-        <w:ind w:firstLineChars="0" w:firstLine="420"/>
-      </w:pPr>
-    </w:p>
-    <w:p>
-      <w:pPr>
-        <w:pStyle w:val="af5"/>
-        <w:ind w:firstLineChars="0" w:firstLine="420"/>
-      </w:pPr>
+        <w:ind w:firstLine="480"/>
+        <w:rPr>
+          <w:noProof/>
+        </w:rPr>
+      </w:pPr>
+      <w:r>
+        <w:rPr>
+          <w:rFonts w:hint="eastAsia"/>
+          <w:noProof/>
+        </w:rPr>
+        <w:t xml:space="preserve"> </w:t>
+      </w:r>
       <w:r>
         <w:rPr>
           <w:noProof/>
         </w:rPr>
         <w:lastRenderedPageBreak/>
         <w:drawing>
-          <wp:inline distT="0" distB="0" distL="0" distR="0" wp14:anchorId="39EAEDB2" wp14:editId="6E737E08">
-            <wp:extent cx="5731510" cy="4253230"/>
-            <wp:effectExtent l="0" t="0" r="2540" b="0"/>
-            <wp:docPr id="125984206" name="图片 1"/>
+          <wp:inline distT="0" distB="0" distL="0" distR="0" wp14:anchorId="26A03596" wp14:editId="0EE5C0E4">
+            <wp:extent cx="3720506" cy="5624865"/>
+            <wp:effectExtent l="318" t="0" r="0" b="0"/>
+            <wp:docPr id="676589240" name="图片 2"/>
             <wp:cNvGraphicFramePr>
               <a:graphicFrameLocks xmlns:a="http://schemas.openxmlformats.org/drawingml/2006/main" noChangeAspect="1"/>
             </wp:cNvGraphicFramePr>
@@ -1043,23 +1025,36 @@
               <a:graphicData uri="http://schemas.openxmlformats.org/drawingml/2006/picture">
                 <pic:pic xmlns:pic="http://schemas.openxmlformats.org/drawingml/2006/picture">
                   <pic:nvPicPr>
-                    <pic:cNvPr id="125984206" name=""/>
-                    <pic:cNvPicPr/>
+                    <pic:cNvPr id="0" name="Picture 6"/>
+                    <pic:cNvPicPr>
+                      <a:picLocks noChangeAspect="1" noChangeArrowheads="1"/>
+                    </pic:cNvPicPr>
                   </pic:nvPicPr>
                   <pic:blipFill>
-                    <a:blip r:embed="rId15"/>
+                    <a:blip r:embed="rId15" cstate="print">
+                      <a:extLst>
+                        <a:ext uri="{28A0092B-C50C-407E-A947-70E740481C1C}">
+                          <a14:useLocalDpi xmlns:a14="http://schemas.microsoft.com/office/drawing/2010/main" val="0"/>
+                        </a:ext>
+                      </a:extLst>
+                    </a:blip>
+                    <a:srcRect/>
                     <a:stretch>
                       <a:fillRect/>
                     </a:stretch>
                   </pic:blipFill>
-                  <pic:spPr>
-                    <a:xfrm>
+                  <pic:spPr bwMode="auto">
+                    <a:xfrm rot="16200000">
                       <a:off x="0" y="0"/>
-                      <a:ext cx="5731510" cy="4253230"/>
+                      <a:ext cx="3729113" cy="5637878"/>
                     </a:xfrm>
                     <a:prstGeom prst="rect">
                       <a:avLst/>
                     </a:prstGeom>
+                    <a:noFill/>
+                    <a:ln>
+                      <a:noFill/>
+                    </a:ln>
                   </pic:spPr>
                 </pic:pic>
               </a:graphicData>
@@ -1071,30 +1066,23 @@
     <w:p>
       <w:pPr>
         <w:pStyle w:val="af5"/>
-        <w:ind w:firstLineChars="0" w:firstLine="420"/>
-        <w:rPr>
-          <w:rFonts w:hint="eastAsia"/>
-        </w:rPr>
-      </w:pPr>
-    </w:p>
-    <w:p>
-      <w:pPr>
-        <w:pStyle w:val="af5"/>
-        <w:ind w:firstLineChars="0" w:firstLine="420"/>
-        <w:rPr>
-          <w:rFonts w:hint="eastAsia"/>
-        </w:rPr>
-      </w:pPr>
-      <w:r>
+        <w:ind w:firstLine="480"/>
         <w:rPr>
           <w:noProof/>
         </w:rPr>
-        <w:lastRenderedPageBreak/>
+      </w:pPr>
+    </w:p>
+    <w:p>
+      <w:pPr>
+        <w:pStyle w:val="af5"/>
+        <w:ind w:firstLine="480"/>
+      </w:pPr>
+      <w:r>
         <w:drawing>
-          <wp:inline distT="0" distB="0" distL="0" distR="0" wp14:anchorId="5A197196" wp14:editId="621803D5">
-            <wp:extent cx="5731510" cy="4345305"/>
-            <wp:effectExtent l="0" t="0" r="2540" b="0"/>
-            <wp:docPr id="349043602" name="图片 1"/>
+          <wp:inline distT="0" distB="0" distL="0" distR="0" wp14:anchorId="3D8CC775" wp14:editId="5DB54A06">
+            <wp:extent cx="3678295" cy="5417191"/>
+            <wp:effectExtent l="6667" t="0" r="5398" b="5397"/>
+            <wp:docPr id="2005718264" name="图片 4"/>
             <wp:cNvGraphicFramePr>
               <a:graphicFrameLocks xmlns:a="http://schemas.openxmlformats.org/drawingml/2006/main" noChangeAspect="1"/>
             </wp:cNvGraphicFramePr>
@@ -1102,23 +1090,36 @@
               <a:graphicData uri="http://schemas.openxmlformats.org/drawingml/2006/picture">
                 <pic:pic xmlns:pic="http://schemas.openxmlformats.org/drawingml/2006/picture">
                   <pic:nvPicPr>
-                    <pic:cNvPr id="349043602" name=""/>
-                    <pic:cNvPicPr/>
+                    <pic:cNvPr id="0" name="Picture 13"/>
+                    <pic:cNvPicPr>
+                      <a:picLocks noChangeAspect="1" noChangeArrowheads="1"/>
+                    </pic:cNvPicPr>
                   </pic:nvPicPr>
                   <pic:blipFill>
-                    <a:blip r:embed="rId16"/>
+                    <a:blip r:embed="rId16" cstate="print">
+                      <a:extLst>
+                        <a:ext uri="{28A0092B-C50C-407E-A947-70E740481C1C}">
+                          <a14:useLocalDpi xmlns:a14="http://schemas.microsoft.com/office/drawing/2010/main" val="0"/>
+                        </a:ext>
+                      </a:extLst>
+                    </a:blip>
+                    <a:srcRect/>
                     <a:stretch>
                       <a:fillRect/>
                     </a:stretch>
                   </pic:blipFill>
-                  <pic:spPr>
-                    <a:xfrm>
+                  <pic:spPr bwMode="auto">
+                    <a:xfrm rot="16200000">
                       <a:off x="0" y="0"/>
-                      <a:ext cx="5731510" cy="4345305"/>
+                      <a:ext cx="3698539" cy="5447005"/>
                     </a:xfrm>
                     <a:prstGeom prst="rect">
                       <a:avLst/>
                     </a:prstGeom>
+                    <a:noFill/>
+                    <a:ln>
+                      <a:noFill/>
+                    </a:ln>
                   </pic:spPr>
                 </pic:pic>
               </a:graphicData>
@@ -1132,46 +1133,19 @@
         <w:pStyle w:val="af5"/>
         <w:ind w:firstLineChars="0" w:firstLine="420"/>
       </w:pPr>
-      <w:r>
-        <w:rPr>
-          <w:rFonts w:hint="eastAsia"/>
-        </w:rPr>
-        <w:t>关于</w:t>
-      </w:r>
-      <w:r>
-        <w:rPr>
-          <w:rFonts w:hint="eastAsia"/>
-        </w:rPr>
-        <w:t>d</w:t>
-      </w:r>
-      <w:r>
-        <w:rPr>
-          <w:rFonts w:hint="eastAsia"/>
-        </w:rPr>
-        <w:t>的选取</w:t>
-      </w:r>
-    </w:p>
-    <w:p>
-      <w:pPr>
-        <w:pStyle w:val="af5"/>
-        <w:ind w:firstLineChars="0" w:firstLine="420"/>
-      </w:pPr>
-    </w:p>
-    <w:p>
-      <w:pPr>
-        <w:pStyle w:val="af5"/>
-        <w:ind w:firstLineChars="0" w:firstLine="420"/>
-      </w:pPr>
-      <w:r>
-        <w:rPr>
-          <w:noProof/>
-        </w:rPr>
+    </w:p>
+    <w:p>
+      <w:pPr>
+        <w:pStyle w:val="af5"/>
+        <w:ind w:firstLine="480"/>
+      </w:pPr>
+      <w:r>
         <w:lastRenderedPageBreak/>
         <w:drawing>
-          <wp:inline distT="0" distB="0" distL="0" distR="0" wp14:anchorId="0B0B31CD" wp14:editId="736A8713">
-            <wp:extent cx="5731510" cy="4295140"/>
-            <wp:effectExtent l="0" t="0" r="2540" b="0"/>
-            <wp:docPr id="992957996" name="图片 1"/>
+          <wp:inline distT="0" distB="0" distL="0" distR="0" wp14:anchorId="47004026" wp14:editId="1AB64657">
+            <wp:extent cx="3771803" cy="5562427"/>
+            <wp:effectExtent l="0" t="0" r="635" b="635"/>
+            <wp:docPr id="1457246738" name="图片 6"/>
             <wp:cNvGraphicFramePr>
               <a:graphicFrameLocks xmlns:a="http://schemas.openxmlformats.org/drawingml/2006/main" noChangeAspect="1"/>
             </wp:cNvGraphicFramePr>
@@ -1179,23 +1153,36 @@
               <a:graphicData uri="http://schemas.openxmlformats.org/drawingml/2006/picture">
                 <pic:pic xmlns:pic="http://schemas.openxmlformats.org/drawingml/2006/picture">
                   <pic:nvPicPr>
-                    <pic:cNvPr id="992957996" name=""/>
-                    <pic:cNvPicPr/>
+                    <pic:cNvPr id="0" name="Picture 20"/>
+                    <pic:cNvPicPr>
+                      <a:picLocks noChangeAspect="1" noChangeArrowheads="1"/>
+                    </pic:cNvPicPr>
                   </pic:nvPicPr>
                   <pic:blipFill>
-                    <a:blip r:embed="rId17"/>
+                    <a:blip r:embed="rId17" cstate="print">
+                      <a:extLst>
+                        <a:ext uri="{28A0092B-C50C-407E-A947-70E740481C1C}">
+                          <a14:useLocalDpi xmlns:a14="http://schemas.microsoft.com/office/drawing/2010/main" val="0"/>
+                        </a:ext>
+                      </a:extLst>
+                    </a:blip>
+                    <a:srcRect/>
                     <a:stretch>
                       <a:fillRect/>
                     </a:stretch>
                   </pic:blipFill>
-                  <pic:spPr>
-                    <a:xfrm>
+                  <pic:spPr bwMode="auto">
+                    <a:xfrm rot="16200000">
                       <a:off x="0" y="0"/>
-                      <a:ext cx="5731510" cy="4295140"/>
+                      <a:ext cx="3783736" cy="5580025"/>
                     </a:xfrm>
                     <a:prstGeom prst="rect">
                       <a:avLst/>
                     </a:prstGeom>
+                    <a:noFill/>
+                    <a:ln>
+                      <a:noFill/>
+                    </a:ln>
                   </pic:spPr>
                 </pic:pic>
               </a:graphicData>
@@ -1203,6 +1190,274 @@
           </wp:inline>
         </w:drawing>
       </w:r>
+    </w:p>
+    <w:p>
+      <w:pPr>
+        <w:pStyle w:val="af5"/>
+        <w:ind w:firstLineChars="0" w:firstLine="420"/>
+      </w:pPr>
+    </w:p>
+    <w:p>
+      <w:pPr>
+        <w:pStyle w:val="af5"/>
+        <w:ind w:firstLine="480"/>
+      </w:pPr>
+      <w:r>
+        <w:drawing>
+          <wp:inline distT="0" distB="0" distL="0" distR="0" wp14:anchorId="3F295B6E" wp14:editId="2BF2BFD6">
+            <wp:extent cx="2868320" cy="5699076"/>
+            <wp:effectExtent l="0" t="5397" r="2857" b="2858"/>
+            <wp:docPr id="1917641581" name="图片 8"/>
+            <wp:cNvGraphicFramePr>
+              <a:graphicFrameLocks xmlns:a="http://schemas.openxmlformats.org/drawingml/2006/main" noChangeAspect="1"/>
+            </wp:cNvGraphicFramePr>
+            <a:graphic xmlns:a="http://schemas.openxmlformats.org/drawingml/2006/main">
+              <a:graphicData uri="http://schemas.openxmlformats.org/drawingml/2006/picture">
+                <pic:pic xmlns:pic="http://schemas.openxmlformats.org/drawingml/2006/picture">
+                  <pic:nvPicPr>
+                    <pic:cNvPr id="0" name="Picture 27"/>
+                    <pic:cNvPicPr>
+                      <a:picLocks noChangeAspect="1" noChangeArrowheads="1"/>
+                    </pic:cNvPicPr>
+                  </pic:nvPicPr>
+                  <pic:blipFill>
+                    <a:blip r:embed="rId18" cstate="print">
+                      <a:extLst>
+                        <a:ext uri="{28A0092B-C50C-407E-A947-70E740481C1C}">
+                          <a14:useLocalDpi xmlns:a14="http://schemas.microsoft.com/office/drawing/2010/main" val="0"/>
+                        </a:ext>
+                      </a:extLst>
+                    </a:blip>
+                    <a:srcRect/>
+                    <a:stretch>
+                      <a:fillRect/>
+                    </a:stretch>
+                  </pic:blipFill>
+                  <pic:spPr bwMode="auto">
+                    <a:xfrm rot="16200000">
+                      <a:off x="0" y="0"/>
+                      <a:ext cx="2875666" cy="5713672"/>
+                    </a:xfrm>
+                    <a:prstGeom prst="rect">
+                      <a:avLst/>
+                    </a:prstGeom>
+                    <a:noFill/>
+                    <a:ln>
+                      <a:noFill/>
+                    </a:ln>
+                  </pic:spPr>
+                </pic:pic>
+              </a:graphicData>
+            </a:graphic>
+          </wp:inline>
+        </w:drawing>
+      </w:r>
+    </w:p>
+    <w:p>
+      <w:pPr>
+        <w:pStyle w:val="af5"/>
+        <w:ind w:firstLine="480"/>
+      </w:pPr>
+    </w:p>
+    <w:p>
+      <w:pPr>
+        <w:pStyle w:val="af5"/>
+        <w:ind w:firstLine="480"/>
+      </w:pPr>
+      <w:r>
+        <w:lastRenderedPageBreak/>
+        <w:drawing>
+          <wp:inline distT="0" distB="0" distL="0" distR="0" wp14:anchorId="3F566B92" wp14:editId="52874F1C">
+            <wp:extent cx="3501748" cy="5276288"/>
+            <wp:effectExtent l="7937" t="0" r="0" b="0"/>
+            <wp:docPr id="231153504" name="图片 10"/>
+            <wp:cNvGraphicFramePr>
+              <a:graphicFrameLocks xmlns:a="http://schemas.openxmlformats.org/drawingml/2006/main" noChangeAspect="1"/>
+            </wp:cNvGraphicFramePr>
+            <a:graphic xmlns:a="http://schemas.openxmlformats.org/drawingml/2006/main">
+              <a:graphicData uri="http://schemas.openxmlformats.org/drawingml/2006/picture">
+                <pic:pic xmlns:pic="http://schemas.openxmlformats.org/drawingml/2006/picture">
+                  <pic:nvPicPr>
+                    <pic:cNvPr id="0" name="Picture 34"/>
+                    <pic:cNvPicPr>
+                      <a:picLocks noChangeAspect="1" noChangeArrowheads="1"/>
+                    </pic:cNvPicPr>
+                  </pic:nvPicPr>
+                  <pic:blipFill>
+                    <a:blip r:embed="rId19" cstate="print">
+                      <a:extLst>
+                        <a:ext uri="{28A0092B-C50C-407E-A947-70E740481C1C}">
+                          <a14:useLocalDpi xmlns:a14="http://schemas.microsoft.com/office/drawing/2010/main" val="0"/>
+                        </a:ext>
+                      </a:extLst>
+                    </a:blip>
+                    <a:srcRect/>
+                    <a:stretch>
+                      <a:fillRect/>
+                    </a:stretch>
+                  </pic:blipFill>
+                  <pic:spPr bwMode="auto">
+                    <a:xfrm rot="16200000">
+                      <a:off x="0" y="0"/>
+                      <a:ext cx="3514450" cy="5295427"/>
+                    </a:xfrm>
+                    <a:prstGeom prst="rect">
+                      <a:avLst/>
+                    </a:prstGeom>
+                    <a:noFill/>
+                    <a:ln>
+                      <a:noFill/>
+                    </a:ln>
+                  </pic:spPr>
+                </pic:pic>
+              </a:graphicData>
+            </a:graphic>
+          </wp:inline>
+        </w:drawing>
+      </w:r>
+    </w:p>
+    <w:p>
+      <w:pPr>
+        <w:pStyle w:val="af5"/>
+        <w:ind w:firstLine="480"/>
+        <w:rPr>
+          <w:rFonts w:hint="eastAsia"/>
+        </w:rPr>
+      </w:pPr>
+    </w:p>
+    <w:p>
+      <w:pPr>
+        <w:pStyle w:val="af5"/>
+        <w:ind w:firstLine="480"/>
+      </w:pPr>
+      <w:r>
+        <w:drawing>
+          <wp:inline distT="0" distB="0" distL="0" distR="0" wp14:anchorId="1A938E07" wp14:editId="3BBCBC0F">
+            <wp:extent cx="3611368" cy="5485471"/>
+            <wp:effectExtent l="0" t="3492" r="4762" b="4763"/>
+            <wp:docPr id="1014312285" name="图片 12"/>
+            <wp:cNvGraphicFramePr>
+              <a:graphicFrameLocks xmlns:a="http://schemas.openxmlformats.org/drawingml/2006/main" noChangeAspect="1"/>
+            </wp:cNvGraphicFramePr>
+            <a:graphic xmlns:a="http://schemas.openxmlformats.org/drawingml/2006/main">
+              <a:graphicData uri="http://schemas.openxmlformats.org/drawingml/2006/picture">
+                <pic:pic xmlns:pic="http://schemas.openxmlformats.org/drawingml/2006/picture">
+                  <pic:nvPicPr>
+                    <pic:cNvPr id="0" name="Picture 41"/>
+                    <pic:cNvPicPr>
+                      <a:picLocks noChangeAspect="1" noChangeArrowheads="1"/>
+                    </pic:cNvPicPr>
+                  </pic:nvPicPr>
+                  <pic:blipFill>
+                    <a:blip r:embed="rId20" cstate="print">
+                      <a:extLst>
+                        <a:ext uri="{28A0092B-C50C-407E-A947-70E740481C1C}">
+                          <a14:useLocalDpi xmlns:a14="http://schemas.microsoft.com/office/drawing/2010/main" val="0"/>
+                        </a:ext>
+                      </a:extLst>
+                    </a:blip>
+                    <a:srcRect/>
+                    <a:stretch>
+                      <a:fillRect/>
+                    </a:stretch>
+                  </pic:blipFill>
+                  <pic:spPr bwMode="auto">
+                    <a:xfrm rot="16200000">
+                      <a:off x="0" y="0"/>
+                      <a:ext cx="3629143" cy="5512470"/>
+                    </a:xfrm>
+                    <a:prstGeom prst="rect">
+                      <a:avLst/>
+                    </a:prstGeom>
+                    <a:noFill/>
+                    <a:ln>
+                      <a:noFill/>
+                    </a:ln>
+                  </pic:spPr>
+                </pic:pic>
+              </a:graphicData>
+            </a:graphic>
+          </wp:inline>
+        </w:drawing>
+      </w:r>
+    </w:p>
+    <w:p>
+      <w:pPr>
+        <w:pStyle w:val="af5"/>
+        <w:ind w:firstLineChars="0" w:firstLine="420"/>
+      </w:pPr>
+    </w:p>
+    <w:p>
+      <w:pPr>
+        <w:pStyle w:val="af5"/>
+        <w:ind w:firstLineChars="0" w:firstLine="420"/>
+      </w:pPr>
+    </w:p>
+    <w:p>
+      <w:pPr>
+        <w:pStyle w:val="af5"/>
+        <w:ind w:firstLineChars="83" w:firstLine="199"/>
+      </w:pPr>
+      <w:r>
+        <w:lastRenderedPageBreak/>
+        <w:drawing>
+          <wp:inline distT="0" distB="0" distL="0" distR="0" wp14:anchorId="728DBE11" wp14:editId="6A32D906">
+            <wp:extent cx="3454536" cy="5491846"/>
+            <wp:effectExtent l="0" t="8890" r="3810" b="3810"/>
+            <wp:docPr id="1163239951" name="图片 14"/>
+            <wp:cNvGraphicFramePr>
+              <a:graphicFrameLocks xmlns:a="http://schemas.openxmlformats.org/drawingml/2006/main" noChangeAspect="1"/>
+            </wp:cNvGraphicFramePr>
+            <a:graphic xmlns:a="http://schemas.openxmlformats.org/drawingml/2006/main">
+              <a:graphicData uri="http://schemas.openxmlformats.org/drawingml/2006/picture">
+                <pic:pic xmlns:pic="http://schemas.openxmlformats.org/drawingml/2006/picture">
+                  <pic:nvPicPr>
+                    <pic:cNvPr id="0" name="Picture 48"/>
+                    <pic:cNvPicPr>
+                      <a:picLocks noChangeAspect="1" noChangeArrowheads="1"/>
+                    </pic:cNvPicPr>
+                  </pic:nvPicPr>
+                  <pic:blipFill>
+                    <a:blip r:embed="rId21" cstate="print">
+                      <a:extLst>
+                        <a:ext uri="{28A0092B-C50C-407E-A947-70E740481C1C}">
+                          <a14:useLocalDpi xmlns:a14="http://schemas.microsoft.com/office/drawing/2010/main" val="0"/>
+                        </a:ext>
+                      </a:extLst>
+                    </a:blip>
+                    <a:srcRect/>
+                    <a:stretch>
+                      <a:fillRect/>
+                    </a:stretch>
+                  </pic:blipFill>
+                  <pic:spPr bwMode="auto">
+                    <a:xfrm rot="16200000">
+                      <a:off x="0" y="0"/>
+                      <a:ext cx="3466971" cy="5511615"/>
+                    </a:xfrm>
+                    <a:prstGeom prst="rect">
+                      <a:avLst/>
+                    </a:prstGeom>
+                    <a:noFill/>
+                    <a:ln>
+                      <a:noFill/>
+                    </a:ln>
+                  </pic:spPr>
+                </pic:pic>
+              </a:graphicData>
+            </a:graphic>
+          </wp:inline>
+        </w:drawing>
+      </w:r>
+    </w:p>
+    <w:p>
+      <w:pPr>
+        <w:pStyle w:val="af5"/>
+        <w:ind w:firstLineChars="0" w:firstLine="420"/>
+        <w:rPr>
+          <w:rFonts w:hint="eastAsia"/>
+        </w:rPr>
+      </w:pPr>
     </w:p>
     <w:sectPr>
       <w:pgSz w:w="11906" w:h="16838"/>

</xml_diff>